<commit_message>
docs: bring the three documents in line with the verify step
The issues page gained a real ทวนสอบงาน action this week and the
documents still described the state before it, so the manual's chapter
on fixing a finding stopped one step short of finishing one.

The manual now carries that step and says what a self-check means:
allowed, because some shifts have one QA supervisor, labelled on the
record, and the manager's approval is the second signature.

The handover's capability list gains the four signatures a finding now
carries - who raised it, who it was given to, who did it, who checked
it - which is the question an auditor opens with.

Test count updated with it.

Co-Authored-By: Claude Opus 5 <noreply@anthropic.com>
</commit_message>
<xml_diff>
--- a/docs/คู่มือการใช้งาน HygienePro.docx
+++ b/docs/คู่มือการใช้งาน HygienePro.docx
@@ -3227,6 +3227,42 @@
         <w:t>จะเห็น: สถานะเปลี่ยนเป็น Resolved และใบจะย้ายไปรอ QA ทวนสอบ</w:t>
       </w:r>
     </w:p>
+    <w:p>
+      <w:pPr>
+        <w:spacing w:after="20"/>
+      </w:pPr>
+      <w:r>
+        <w:rPr>
+          <w:rFonts w:ascii="Tahoma" w:hAnsi="Tahoma" w:cs="Tahoma" w:eastAsia="Tahoma"/>
+          <w:b/>
+          <w:color w:val="1F4E79"/>
+          <w:sz w:val="21"/>
+        </w:rPr>
+        <w:t xml:space="preserve">ขั้นที่ 5  </w:t>
+      </w:r>
+      <w:r>
+        <w:rPr>
+          <w:rFonts w:ascii="Tahoma" w:hAnsi="Tahoma" w:cs="Tahoma" w:eastAsia="Tahoma"/>
+          <w:b/>
+          <w:sz w:val="21"/>
+        </w:rPr>
+        <w:t>QA กดปุ่ม ทวนสอบงาน สีเขียวบนใบนั้น เพื่อยืนยันว่าแก้ไขจริง</w:t>
+      </w:r>
+    </w:p>
+    <w:p>
+      <w:pPr>
+        <w:spacing w:after="160"/>
+        <w:ind w:left="907"/>
+      </w:pPr>
+      <w:r>
+        <w:rPr>
+          <w:rFonts w:ascii="Tahoma" w:hAnsi="Tahoma" w:cs="Tahoma" w:eastAsia="Tahoma"/>
+          <w:color w:val="606060"/>
+          <w:sz w:val="20"/>
+        </w:rPr>
+        <w:t>จะเห็น: สถานะเปลี่ยนเป็น Verified ใบย้ายไปฝั่งประวัติ และเข้าคิวรอผู้จัดการอนุมัติปิดงาน</w:t>
+      </w:r>
+    </w:p>
     <w:tbl>
       <w:tblPr>
         <w:tblStyle w:val="TableGrid"/>
@@ -3310,6 +3346,39 @@
                 <w:sz w:val="19"/>
               </w:rPr>
               <w:t>ระบบจะไม่ยอมให้ปิดใบที่ไม่ได้กรอกวิธีแก้ไข เพราะใบที่ปิดโดยไม่มีบันทึกจะใช้ตอบผู้ตรวจประเมินไม่ได้ ถ้าไปตรวจซ้ำแล้วไม่พบปัญหาแล้ว ให้พิมพ์ข้อความนั้นลงไปเช่นกัน</w:t>
+            </w:r>
+          </w:p>
+        </w:tc>
+      </w:tr>
+    </w:tbl>
+    <w:p>
+      <w:pPr>
+        <w:spacing w:after="40"/>
+      </w:pPr>
+    </w:p>
+    <w:tbl>
+      <w:tblPr>
+        <w:tblStyle w:val="TableGrid"/>
+        <w:tblW w:type="auto" w:w="0"/>
+        <w:tblLook w:firstColumn="1" w:firstRow="1" w:lastColumn="0" w:lastRow="0" w:noHBand="0" w:noVBand="1" w:val="04A0"/>
+      </w:tblPr>
+      <w:tblGrid>
+        <w:gridCol w:w="8640"/>
+      </w:tblGrid>
+      <w:tr>
+        <w:tc>
+          <w:tcPr>
+            <w:tcW w:type="dxa" w:w="8640"/>
+            <w:shd w:val="clear" w:fill="FFF4CE"/>
+          </w:tcPr>
+          <w:p>
+            <w:r/>
+            <w:r>
+              <w:rPr>
+                <w:rFonts w:ascii="Tahoma" w:hAnsi="Tahoma" w:cs="Tahoma" w:eastAsia="Tahoma"/>
+                <w:sz w:val="19"/>
+              </w:rPr>
+              <w:t>ถ้าคนที่แก้ไขกับคนที่ทวนสอบเป็นคนเดียวกัน ระบบยอมให้ทำได้ เพราะบางกะมี QA อยู่คนเดียว แต่จะติดป้ายไว้บนใบว่า แก้ไข+ทวนสอบคนเดียวกัน เพื่อให้ผู้ตรวจประเมินเห็นได้ ลายเซ็นที่สองของใบนั้นคือการอนุมัติของผู้จัดการ</w:t>
             </w:r>
           </w:p>
         </w:tc>

</xml_diff>